<commit_message>
Mis à jours conception
</commit_message>
<xml_diff>
--- a/Conception.docx
+++ b/Conception.docx
@@ -4,7 +4,11 @@
   <w:body>
     <w:p>
       <w:pPr>
-        <w:pStyle w:val="Titre2"/>
+        <w:pStyle w:val="Heading2"/>
+        <w:numPr>
+          <w:ilvl w:val="1"/>
+          <w:numId w:val="1"/>
+        </w:numPr>
         <w:bidi w:val="0"/>
         <w:spacing w:before="200" w:after="120"/>
         <w:jc w:val="left"/>
@@ -12,11 +16,7 @@
       </w:pPr>
       <w:r>
         <w:rPr/>
-        <w:t xml:space="preserve">CAS POSSIBLE // </w:t>
-      </w:r>
-      <w:r>
-        <w:rPr/>
-        <w:t>NOTIFICATION</w:t>
+        <w:t>CAS POSSIBLE // NOTIFICATION</w:t>
       </w:r>
     </w:p>
     <w:p>
@@ -26,7 +26,6 @@
         <w:jc w:val="left"/>
         <w:rPr>
           <w:b/>
-          <w:b/>
           <w:bCs/>
         </w:rPr>
       </w:pPr>
@@ -44,6 +43,20 @@
         </w:rPr>
         <w:t>Telephone déconnecté internet</w:t>
       </w:r>
+      <w:r>
+        <w:rPr>
+          <w:b/>
+          <w:bCs/>
+        </w:rPr>
+        <w:t xml:space="preserve"> </w:t>
+      </w:r>
+      <w:r>
+        <w:rPr>
+          <w:b/>
+          <w:bCs/>
+        </w:rPr>
+        <w:t>=&gt; Anjara</w:t>
+      </w:r>
     </w:p>
     <w:p>
       <w:pPr>
@@ -52,7 +65,6 @@
         <w:jc w:val="left"/>
         <w:rPr>
           <w:b/>
-          <w:b/>
           <w:bCs/>
         </w:rPr>
       </w:pPr>
@@ -70,6 +82,20 @@
         </w:rPr>
         <w:t>Téléphone connecté avec latence</w:t>
       </w:r>
+      <w:r>
+        <w:rPr>
+          <w:b/>
+          <w:bCs/>
+        </w:rPr>
+        <w:t xml:space="preserve"> </w:t>
+      </w:r>
+      <w:r>
+        <w:rPr>
+          <w:b/>
+          <w:bCs/>
+        </w:rPr>
+        <w:t>=&gt; Anjara</w:t>
+      </w:r>
     </w:p>
     <w:p>
       <w:pPr>
@@ -77,7 +103,6 @@
         <w:bidi w:val="0"/>
         <w:jc w:val="left"/>
         <w:rPr>
-          <w:b/>
           <w:b/>
           <w:bCs/>
         </w:rPr>
@@ -113,7 +138,14 @@
           <w:b w:val="false"/>
           <w:bCs w:val="false"/>
         </w:rPr>
-        <w:t>Pc physique eteint (Hors Service)</w:t>
+        <w:t xml:space="preserve">Pc physique eteint (Hors Service)                    </w:t>
+      </w:r>
+      <w:r>
+        <w:rPr>
+          <w:b w:val="false"/>
+          <w:bCs w:val="false"/>
+        </w:rPr>
+        <w:t xml:space="preserve">=&gt; Nathan ambiny </w:t>
       </w:r>
     </w:p>
     <w:p>
@@ -180,7 +212,6 @@
         <w:jc w:val="left"/>
         <w:rPr>
           <w:b/>
-          <w:b/>
           <w:bCs/>
         </w:rPr>
       </w:pPr>
@@ -198,6 +229,20 @@
         </w:rPr>
         <w:t>Serveur accèssible avec latence</w:t>
       </w:r>
+      <w:r>
+        <w:rPr>
+          <w:b/>
+          <w:bCs/>
+        </w:rPr>
+        <w:t xml:space="preserve"> </w:t>
+      </w:r>
+      <w:r>
+        <w:rPr>
+          <w:b/>
+          <w:bCs/>
+        </w:rPr>
+        <w:t>=&gt; Tianjara</w:t>
+      </w:r>
     </w:p>
     <w:p>
       <w:pPr>
@@ -206,7 +251,6 @@
         <w:jc w:val="left"/>
         <w:rPr>
           <w:b/>
-          <w:b/>
           <w:bCs/>
         </w:rPr>
       </w:pPr>
@@ -224,6 +268,20 @@
         </w:rPr>
         <w:t>Serveur accèssible avec erreur 500</w:t>
       </w:r>
+      <w:r>
+        <w:rPr>
+          <w:b/>
+          <w:bCs/>
+        </w:rPr>
+        <w:t xml:space="preserve"> </w:t>
+      </w:r>
+      <w:r>
+        <w:rPr>
+          <w:b/>
+          <w:bCs/>
+        </w:rPr>
+        <w:t>=&gt; Tianjara</w:t>
+      </w:r>
     </w:p>
     <w:p>
       <w:pPr>
@@ -232,20 +290,23 @@
         <w:jc w:val="left"/>
         <w:rPr>
           <w:b w:val="false"/>
-          <w:b w:val="false"/>
-          <w:bCs w:val="false"/>
-        </w:rPr>
-      </w:pPr>
-      <w:r>
-        <w:rPr>
-          <w:b/>
-          <w:bCs/>
-        </w:rPr>
-      </w:r>
-    </w:p>
-    <w:p>
-      <w:pPr>
-        <w:pStyle w:val="Titre2"/>
+          <w:bCs w:val="false"/>
+        </w:rPr>
+      </w:pPr>
+      <w:r>
+        <w:rPr>
+          <w:b w:val="false"/>
+          <w:bCs w:val="false"/>
+        </w:rPr>
+      </w:r>
+    </w:p>
+    <w:p>
+      <w:pPr>
+        <w:pStyle w:val="Heading2"/>
+        <w:numPr>
+          <w:ilvl w:val="1"/>
+          <w:numId w:val="1"/>
+        </w:numPr>
         <w:bidi w:val="0"/>
         <w:jc w:val="left"/>
         <w:rPr/>
@@ -257,13 +318,12 @@
     </w:p>
     <w:p>
       <w:pPr>
-        <w:pStyle w:val="Corpsdetexte"/>
+        <w:pStyle w:val="BodyText"/>
         <w:bidi w:val="0"/>
         <w:spacing w:before="0" w:after="0"/>
         <w:jc w:val="left"/>
         <w:rPr>
           <w:b/>
-          <w:b/>
           <w:bCs/>
         </w:rPr>
       </w:pPr>
@@ -284,13 +344,12 @@
     </w:p>
     <w:p>
       <w:pPr>
-        <w:pStyle w:val="Corpsdetexte"/>
+        <w:pStyle w:val="BodyText"/>
         <w:bidi w:val="0"/>
         <w:spacing w:before="0" w:after="0"/>
         <w:jc w:val="left"/>
         <w:rPr>
           <w:b/>
-          <w:b/>
           <w:bCs/>
         </w:rPr>
       </w:pPr>
@@ -311,13 +370,12 @@
     </w:p>
     <w:p>
       <w:pPr>
-        <w:pStyle w:val="Corpsdetexte"/>
+        <w:pStyle w:val="BodyText"/>
         <w:bidi w:val="0"/>
         <w:spacing w:before="0" w:after="0"/>
         <w:jc w:val="left"/>
         <w:rPr>
           <w:b/>
-          <w:b/>
           <w:bCs/>
         </w:rPr>
       </w:pPr>
@@ -331,7 +389,7 @@
     </w:p>
     <w:p>
       <w:pPr>
-        <w:pStyle w:val="Corpsdetexte"/>
+        <w:pStyle w:val="BodyText"/>
         <w:numPr>
           <w:ilvl w:val="0"/>
           <w:numId w:val="3"/>
@@ -341,7 +399,6 @@
         <w:jc w:val="left"/>
         <w:rPr>
           <w:b w:val="false"/>
-          <w:b w:val="false"/>
           <w:bCs w:val="false"/>
         </w:rPr>
       </w:pPr>
@@ -355,7 +412,7 @@
     </w:p>
     <w:p>
       <w:pPr>
-        <w:pStyle w:val="Corpsdetexte"/>
+        <w:pStyle w:val="BodyText"/>
         <w:numPr>
           <w:ilvl w:val="0"/>
           <w:numId w:val="3"/>
@@ -365,7 +422,6 @@
         <w:jc w:val="left"/>
         <w:rPr>
           <w:b w:val="false"/>
-          <w:b w:val="false"/>
           <w:bCs w:val="false"/>
         </w:rPr>
       </w:pPr>
@@ -379,7 +435,7 @@
     </w:p>
     <w:p>
       <w:pPr>
-        <w:pStyle w:val="Corpsdetexte"/>
+        <w:pStyle w:val="BodyText"/>
         <w:numPr>
           <w:ilvl w:val="0"/>
           <w:numId w:val="3"/>
@@ -389,28 +445,20 @@
         <w:jc w:val="left"/>
         <w:rPr>
           <w:b w:val="false"/>
-          <w:b w:val="false"/>
-          <w:bCs w:val="false"/>
-        </w:rPr>
-      </w:pPr>
-      <w:r>
-        <w:rPr>
-          <w:b w:val="false"/>
-          <w:bCs w:val="false"/>
-        </w:rPr>
-        <w:t xml:space="preserve">Verifier serveur physique // </w:t>
-      </w:r>
-      <w:r>
-        <w:rPr>
-          <w:b w:val="false"/>
-          <w:bCs w:val="false"/>
-        </w:rPr>
-        <w:t>serveur essayant de se reconnecter à internet</w:t>
-      </w:r>
-    </w:p>
-    <w:p>
-      <w:pPr>
-        <w:pStyle w:val="Corpsdetexte"/>
+          <w:bCs w:val="false"/>
+        </w:rPr>
+      </w:pPr>
+      <w:r>
+        <w:rPr>
+          <w:b w:val="false"/>
+          <w:bCs w:val="false"/>
+        </w:rPr>
+        <w:t>Verifier serveur physique // serveur essayant de se reconnecter à internet</w:t>
+      </w:r>
+    </w:p>
+    <w:p>
+      <w:pPr>
+        <w:pStyle w:val="BodyText"/>
         <w:numPr>
           <w:ilvl w:val="0"/>
           <w:numId w:val="3"/>
@@ -420,34 +468,25 @@
         <w:jc w:val="left"/>
         <w:rPr>
           <w:b w:val="false"/>
-          <w:b w:val="false"/>
-          <w:bCs w:val="false"/>
-        </w:rPr>
-      </w:pPr>
-      <w:r>
-        <w:rPr>
-          <w:b w:val="false"/>
-          <w:bCs w:val="false"/>
-        </w:rPr>
-        <w:t xml:space="preserve">Verifier serveur physique // </w:t>
-      </w:r>
-      <w:r>
-        <w:rPr>
-          <w:b w:val="false"/>
-          <w:bCs w:val="false"/>
-        </w:rPr>
-        <w:t>serveur essayant de se connecter à un autre reseau</w:t>
-      </w:r>
-    </w:p>
-    <w:p>
-      <w:pPr>
-        <w:pStyle w:val="Corpsdetexte"/>
+          <w:bCs w:val="false"/>
+        </w:rPr>
+      </w:pPr>
+      <w:r>
+        <w:rPr>
+          <w:b w:val="false"/>
+          <w:bCs w:val="false"/>
+        </w:rPr>
+        <w:t>Verifier serveur physique // serveur essayant de se connecter à un autre reseau</w:t>
+      </w:r>
+    </w:p>
+    <w:p>
+      <w:pPr>
+        <w:pStyle w:val="BodyText"/>
         <w:bidi w:val="0"/>
         <w:spacing w:before="0" w:after="0"/>
         <w:jc w:val="left"/>
         <w:rPr>
           <w:b/>
-          <w:b/>
           <w:bCs/>
         </w:rPr>
       </w:pPr>
@@ -468,12 +507,11 @@
     </w:p>
     <w:p>
       <w:pPr>
-        <w:pStyle w:val="Corpsdetexte"/>
+        <w:pStyle w:val="BodyText"/>
         <w:bidi w:val="0"/>
         <w:spacing w:before="0" w:after="0"/>
         <w:jc w:val="left"/>
         <w:rPr>
-          <w:b/>
           <w:b/>
           <w:bCs/>
         </w:rPr>
@@ -500,6 +538,7 @@
       <w:pgNumType w:fmt="decimal"/>
       <w:formProt w:val="false"/>
       <w:textDirection w:val="lrTb"/>
+      <w:docGrid w:type="default" w:linePitch="100" w:charSpace="0"/>
     </w:sectPr>
   </w:body>
 </w:document>
@@ -520,20 +559,21 @@
         </w:tabs>
         <w:ind w:left="0" w:hanging="0"/>
       </w:pPr>
+      <w:rPr/>
     </w:lvl>
     <w:lvl w:ilvl="1">
       <w:start w:val="1"/>
-      <w:pStyle w:val="Titre2"/>
-      <w:numFmt w:val="none"/>
-      <w:suff w:val="nothing"/>
-      <w:lvlText w:val=""/>
-      <w:lvlJc w:val="left"/>
-      <w:pPr>
-        <w:tabs>
-          <w:tab w:val="num" w:pos="0"/>
-        </w:tabs>
-        <w:ind w:left="0" w:hanging="0"/>
-      </w:pPr>
+      <w:numFmt w:val="none"/>
+      <w:suff w:val="nothing"/>
+      <w:lvlText w:val=""/>
+      <w:lvlJc w:val="left"/>
+      <w:pPr>
+        <w:tabs>
+          <w:tab w:val="num" w:pos="0"/>
+        </w:tabs>
+        <w:ind w:left="0" w:hanging="0"/>
+      </w:pPr>
+      <w:rPr/>
     </w:lvl>
     <w:lvl w:ilvl="2">
       <w:start w:val="1"/>
@@ -547,6 +587,7 @@
         </w:tabs>
         <w:ind w:left="0" w:hanging="0"/>
       </w:pPr>
+      <w:rPr/>
     </w:lvl>
     <w:lvl w:ilvl="3">
       <w:start w:val="1"/>
@@ -560,6 +601,7 @@
         </w:tabs>
         <w:ind w:left="0" w:hanging="0"/>
       </w:pPr>
+      <w:rPr/>
     </w:lvl>
     <w:lvl w:ilvl="4">
       <w:start w:val="1"/>
@@ -573,6 +615,7 @@
         </w:tabs>
         <w:ind w:left="0" w:hanging="0"/>
       </w:pPr>
+      <w:rPr/>
     </w:lvl>
     <w:lvl w:ilvl="5">
       <w:start w:val="1"/>
@@ -586,6 +629,7 @@
         </w:tabs>
         <w:ind w:left="0" w:hanging="0"/>
       </w:pPr>
+      <w:rPr/>
     </w:lvl>
     <w:lvl w:ilvl="6">
       <w:start w:val="1"/>
@@ -599,6 +643,7 @@
         </w:tabs>
         <w:ind w:left="0" w:hanging="0"/>
       </w:pPr>
+      <w:rPr/>
     </w:lvl>
     <w:lvl w:ilvl="7">
       <w:start w:val="1"/>
@@ -612,6 +657,7 @@
         </w:tabs>
         <w:ind w:left="0" w:hanging="0"/>
       </w:pPr>
+      <w:rPr/>
     </w:lvl>
     <w:lvl w:ilvl="8">
       <w:start w:val="1"/>
@@ -625,6 +671,7 @@
         </w:tabs>
         <w:ind w:left="0" w:hanging="0"/>
       </w:pPr>
+      <w:rPr/>
     </w:lvl>
   </w:abstractNum>
   <w:abstractNum w:abstractNumId="2">
@@ -863,6 +910,125 @@
         <w:ind w:left="3600" w:hanging="360"/>
       </w:pPr>
       <w:rPr/>
+    </w:lvl>
+  </w:abstractNum>
+  <w:abstractNum w:abstractNumId="4">
+    <w:lvl w:ilvl="0">
+      <w:start w:val="1"/>
+      <w:numFmt w:val="none"/>
+      <w:suff w:val="nothing"/>
+      <w:lvlText w:val=""/>
+      <w:lvlJc w:val="left"/>
+      <w:pPr>
+        <w:tabs>
+          <w:tab w:val="num" w:pos="0"/>
+        </w:tabs>
+        <w:ind w:left="0" w:hanging="0"/>
+      </w:pPr>
+    </w:lvl>
+    <w:lvl w:ilvl="1">
+      <w:start w:val="1"/>
+      <w:numFmt w:val="none"/>
+      <w:suff w:val="nothing"/>
+      <w:lvlText w:val=""/>
+      <w:lvlJc w:val="left"/>
+      <w:pPr>
+        <w:tabs>
+          <w:tab w:val="num" w:pos="0"/>
+        </w:tabs>
+        <w:ind w:left="0" w:hanging="0"/>
+      </w:pPr>
+    </w:lvl>
+    <w:lvl w:ilvl="2">
+      <w:start w:val="1"/>
+      <w:numFmt w:val="none"/>
+      <w:suff w:val="nothing"/>
+      <w:lvlText w:val=""/>
+      <w:lvlJc w:val="left"/>
+      <w:pPr>
+        <w:tabs>
+          <w:tab w:val="num" w:pos="0"/>
+        </w:tabs>
+        <w:ind w:left="0" w:hanging="0"/>
+      </w:pPr>
+    </w:lvl>
+    <w:lvl w:ilvl="3">
+      <w:start w:val="1"/>
+      <w:numFmt w:val="none"/>
+      <w:suff w:val="nothing"/>
+      <w:lvlText w:val=""/>
+      <w:lvlJc w:val="left"/>
+      <w:pPr>
+        <w:tabs>
+          <w:tab w:val="num" w:pos="0"/>
+        </w:tabs>
+        <w:ind w:left="0" w:hanging="0"/>
+      </w:pPr>
+    </w:lvl>
+    <w:lvl w:ilvl="4">
+      <w:start w:val="1"/>
+      <w:numFmt w:val="none"/>
+      <w:suff w:val="nothing"/>
+      <w:lvlText w:val=""/>
+      <w:lvlJc w:val="left"/>
+      <w:pPr>
+        <w:tabs>
+          <w:tab w:val="num" w:pos="0"/>
+        </w:tabs>
+        <w:ind w:left="0" w:hanging="0"/>
+      </w:pPr>
+    </w:lvl>
+    <w:lvl w:ilvl="5">
+      <w:start w:val="1"/>
+      <w:numFmt w:val="none"/>
+      <w:suff w:val="nothing"/>
+      <w:lvlText w:val=""/>
+      <w:lvlJc w:val="left"/>
+      <w:pPr>
+        <w:tabs>
+          <w:tab w:val="num" w:pos="0"/>
+        </w:tabs>
+        <w:ind w:left="0" w:hanging="0"/>
+      </w:pPr>
+    </w:lvl>
+    <w:lvl w:ilvl="6">
+      <w:start w:val="1"/>
+      <w:numFmt w:val="none"/>
+      <w:suff w:val="nothing"/>
+      <w:lvlText w:val=""/>
+      <w:lvlJc w:val="left"/>
+      <w:pPr>
+        <w:tabs>
+          <w:tab w:val="num" w:pos="0"/>
+        </w:tabs>
+        <w:ind w:left="0" w:hanging="0"/>
+      </w:pPr>
+    </w:lvl>
+    <w:lvl w:ilvl="7">
+      <w:start w:val="1"/>
+      <w:numFmt w:val="none"/>
+      <w:suff w:val="nothing"/>
+      <w:lvlText w:val=""/>
+      <w:lvlJc w:val="left"/>
+      <w:pPr>
+        <w:tabs>
+          <w:tab w:val="num" w:pos="0"/>
+        </w:tabs>
+        <w:ind w:left="0" w:hanging="0"/>
+      </w:pPr>
+    </w:lvl>
+    <w:lvl w:ilvl="8">
+      <w:start w:val="1"/>
+      <w:numFmt w:val="none"/>
+      <w:suff w:val="nothing"/>
+      <w:lvlText w:val=""/>
+      <w:lvlJc w:val="left"/>
+      <w:pPr>
+        <w:tabs>
+          <w:tab w:val="num" w:pos="0"/>
+        </w:tabs>
+        <w:ind w:left="0" w:hanging="0"/>
+      </w:pPr>
     </w:lvl>
   </w:abstractNum>
   <w:num w:numId="1">
@@ -873,6 +1039,9 @@
   </w:num>
   <w:num w:numId="3">
     <w:abstractNumId w:val="3"/>
+  </w:num>
+  <w:num w:numId="4">
+    <w:abstractNumId w:val="4"/>
   </w:num>
 </w:numbering>
 </file>
@@ -891,7 +1060,6 @@
     </w:rPrDefault>
     <w:pPrDefault>
       <w:pPr>
-        <w:widowControl/>
         <w:suppressAutoHyphens w:val="true"/>
       </w:pPr>
     </w:pPrDefault>
@@ -901,7 +1069,10 @@
     <w:qFormat/>
     <w:pPr>
       <w:widowControl/>
+      <w:suppressAutoHyphens w:val="true"/>
       <w:bidi w:val="0"/>
+      <w:spacing w:before="0" w:after="0"/>
+      <w:jc w:val="left"/>
     </w:pPr>
     <w:rPr>
       <w:rFonts w:ascii="Liberation Serif" w:hAnsi="Liberation Serif" w:eastAsia="Noto Serif CJK SC" w:cs="Lohit Devanagari"/>
@@ -912,10 +1083,10 @@
       <w:lang w:val="fr-FR" w:eastAsia="zh-CN" w:bidi="hi-IN"/>
     </w:rPr>
   </w:style>
-  <w:style w:type="paragraph" w:styleId="Titre2">
+  <w:style w:type="paragraph" w:styleId="Heading2">
     <w:name w:val="Heading 2"/>
     <w:basedOn w:val="Titre"/>
-    <w:next w:val="Corpsdetexte"/>
+    <w:next w:val="BodyText"/>
     <w:qFormat/>
     <w:pPr>
       <w:numPr>
@@ -947,7 +1118,7 @@
   <w:style w:type="paragraph" w:styleId="Titre">
     <w:name w:val="Titre"/>
     <w:basedOn w:val="Normal"/>
-    <w:next w:val="Corpsdetexte"/>
+    <w:next w:val="BodyText"/>
     <w:qFormat/>
     <w:pPr>
       <w:keepNext w:val="true"/>
@@ -959,7 +1130,7 @@
       <w:szCs w:val="28"/>
     </w:rPr>
   </w:style>
-  <w:style w:type="paragraph" w:styleId="Corpsdetexte">
+  <w:style w:type="paragraph" w:styleId="BodyText">
     <w:name w:val="Body Text"/>
     <w:basedOn w:val="Normal"/>
     <w:pPr>
@@ -967,15 +1138,15 @@
     </w:pPr>
     <w:rPr/>
   </w:style>
-  <w:style w:type="paragraph" w:styleId="Liste">
+  <w:style w:type="paragraph" w:styleId="List">
     <w:name w:val="List"/>
-    <w:basedOn w:val="Corpsdetexte"/>
+    <w:basedOn w:val="BodyText"/>
     <w:pPr/>
     <w:rPr>
       <w:rFonts w:cs="Lohit Devanagari"/>
     </w:rPr>
   </w:style>
-  <w:style w:type="paragraph" w:styleId="Lgende">
+  <w:style w:type="paragraph" w:styleId="Caption">
     <w:name w:val="Caption"/>
     <w:basedOn w:val="Normal"/>
     <w:qFormat/>
@@ -1003,4 +1174,110 @@
     </w:rPr>
   </w:style>
 </w:styles>
+</file>
+
+<file path=word/theme/theme1.xml><?xml version="1.0" encoding="utf-8"?>
+<a:theme xmlns:a="http://schemas.openxmlformats.org/drawingml/2006/main" xmlns:r="http://schemas.openxmlformats.org/officeDocument/2006/relationships" name="Office">
+  <a:themeElements>
+    <a:clrScheme name="LibreOffice">
+      <a:dk1>
+        <a:srgbClr val="000000"/>
+      </a:dk1>
+      <a:lt1>
+        <a:srgbClr val="ffffff"/>
+      </a:lt1>
+      <a:dk2>
+        <a:srgbClr val="000000"/>
+      </a:dk2>
+      <a:lt2>
+        <a:srgbClr val="ffffff"/>
+      </a:lt2>
+      <a:accent1>
+        <a:srgbClr val="18a303"/>
+      </a:accent1>
+      <a:accent2>
+        <a:srgbClr val="0369a3"/>
+      </a:accent2>
+      <a:accent3>
+        <a:srgbClr val="a33e03"/>
+      </a:accent3>
+      <a:accent4>
+        <a:srgbClr val="8e03a3"/>
+      </a:accent4>
+      <a:accent5>
+        <a:srgbClr val="c99c00"/>
+      </a:accent5>
+      <a:accent6>
+        <a:srgbClr val="c9211e"/>
+      </a:accent6>
+      <a:hlink>
+        <a:srgbClr val="0000ee"/>
+      </a:hlink>
+      <a:folHlink>
+        <a:srgbClr val="551a8b"/>
+      </a:folHlink>
+    </a:clrScheme>
+    <a:fontScheme name="Office">
+      <a:majorFont>
+        <a:latin typeface="Arial" pitchFamily="0" charset="1"/>
+        <a:ea typeface="DejaVu Sans" pitchFamily="0" charset="1"/>
+        <a:cs typeface="DejaVu Sans" pitchFamily="0" charset="1"/>
+      </a:majorFont>
+      <a:minorFont>
+        <a:latin typeface="Arial" pitchFamily="0" charset="1"/>
+        <a:ea typeface="DejaVu Sans" pitchFamily="0" charset="1"/>
+        <a:cs typeface="DejaVu Sans" pitchFamily="0" charset="1"/>
+      </a:minorFont>
+    </a:fontScheme>
+    <a:fmtScheme>
+      <a:fillStyleLst>
+        <a:solidFill>
+          <a:schemeClr val="phClr"/>
+        </a:solidFill>
+        <a:solidFill>
+          <a:schemeClr val="phClr"/>
+        </a:solidFill>
+        <a:solidFill>
+          <a:schemeClr val="phClr"/>
+        </a:solidFill>
+      </a:fillStyleLst>
+      <a:lnStyleLst>
+        <a:ln w="6350" cap="flat" cmpd="sng" algn="ctr">
+          <a:prstDash val="solid"/>
+          <a:miter/>
+        </a:ln>
+        <a:ln w="6350" cap="flat" cmpd="sng" algn="ctr">
+          <a:prstDash val="solid"/>
+          <a:miter/>
+        </a:ln>
+        <a:ln w="6350" cap="flat" cmpd="sng" algn="ctr">
+          <a:prstDash val="solid"/>
+          <a:miter/>
+        </a:ln>
+      </a:lnStyleLst>
+      <a:effectStyleLst>
+        <a:effectStyle>
+          <a:effectLst/>
+        </a:effectStyle>
+        <a:effectStyle>
+          <a:effectLst/>
+        </a:effectStyle>
+        <a:effectStyle>
+          <a:effectLst/>
+        </a:effectStyle>
+      </a:effectStyleLst>
+      <a:bgFillStyleLst>
+        <a:solidFill>
+          <a:schemeClr val="phClr"/>
+        </a:solidFill>
+        <a:solidFill>
+          <a:schemeClr val="phClr"/>
+        </a:solidFill>
+        <a:solidFill>
+          <a:schemeClr val="phClr"/>
+        </a:solidFill>
+      </a:bgFillStyleLst>
+    </a:fmtScheme>
+  </a:themeElements>
+</a:theme>
 </file>
</xml_diff>

<commit_message>
ajout de la conception
</commit_message>
<xml_diff>
--- a/Conception.docx
+++ b/Conception.docx
@@ -4,7 +4,7 @@
   <w:body>
     <w:p>
       <w:pPr>
-        <w:pStyle w:val="Heading2"/>
+        <w:pStyle w:val="Titre2"/>
         <w:numPr>
           <w:ilvl w:val="1"/>
           <w:numId w:val="1"/>
@@ -26,6 +26,7 @@
         <w:jc w:val="left"/>
         <w:rPr>
           <w:b/>
+          <w:b/>
           <w:bCs/>
         </w:rPr>
       </w:pPr>
@@ -58,6 +59,7 @@
         <w:jc w:val="left"/>
         <w:rPr>
           <w:b/>
+          <w:b/>
           <w:bCs/>
         </w:rPr>
       </w:pPr>
@@ -89,6 +91,7 @@
         <w:bidi w:val="0"/>
         <w:jc w:val="left"/>
         <w:rPr>
+          <w:b/>
           <w:b/>
           <w:bCs/>
         </w:rPr>
@@ -124,21 +127,7 @@
           <w:b w:val="false"/>
           <w:bCs w:val="false"/>
         </w:rPr>
-        <w:t>P</w:t>
-      </w:r>
-      <w:r>
-        <w:rPr>
-          <w:b w:val="false"/>
-          <w:bCs w:val="false"/>
-        </w:rPr>
-        <w:t>C</w:t>
-      </w:r>
-      <w:r>
-        <w:rPr>
-          <w:b w:val="false"/>
-          <w:bCs w:val="false"/>
-        </w:rPr>
-        <w:t xml:space="preserve"> physique éteint (Hors Service)                    =&gt; Nathan ambiny </w:t>
+        <w:t xml:space="preserve">PC physique éteint (Hors Service)                    =&gt; Nathan ambiny </w:t>
       </w:r>
     </w:p>
     <w:p>
@@ -176,21 +165,7 @@
           <w:b w:val="false"/>
           <w:bCs w:val="false"/>
         </w:rPr>
-        <w:t>P</w:t>
-      </w:r>
-      <w:r>
-        <w:rPr>
-          <w:b w:val="false"/>
-          <w:bCs w:val="false"/>
-        </w:rPr>
-        <w:t>C</w:t>
-      </w:r>
-      <w:r>
-        <w:rPr>
-          <w:b w:val="false"/>
-          <w:bCs w:val="false"/>
-        </w:rPr>
-        <w:t xml:space="preserve"> physique non connecté à internet</w:t>
+        <w:t>PC physique non connecté à internet</w:t>
       </w:r>
     </w:p>
     <w:p>
@@ -209,21 +184,7 @@
           <w:b w:val="false"/>
           <w:bCs w:val="false"/>
         </w:rPr>
-        <w:t>P</w:t>
-      </w:r>
-      <w:r>
-        <w:rPr>
-          <w:b w:val="false"/>
-          <w:bCs w:val="false"/>
-        </w:rPr>
-        <w:t>C</w:t>
-      </w:r>
-      <w:r>
-        <w:rPr>
-          <w:b w:val="false"/>
-          <w:bCs w:val="false"/>
-        </w:rPr>
-        <w:t xml:space="preserve"> friendzone (Connecté sans accès internet)</w:t>
+        <w:t>PC friendzone (Connecté sans accès internet)</w:t>
       </w:r>
     </w:p>
     <w:p>
@@ -233,6 +194,7 @@
         <w:jc w:val="left"/>
         <w:rPr>
           <w:b/>
+          <w:b/>
           <w:bCs/>
         </w:rPr>
       </w:pPr>
@@ -265,6 +227,7 @@
         <w:jc w:val="left"/>
         <w:rPr>
           <w:b/>
+          <w:b/>
           <w:bCs/>
         </w:rPr>
       </w:pPr>
@@ -297,19 +260,20 @@
         <w:jc w:val="left"/>
         <w:rPr>
           <w:b w:val="false"/>
-          <w:bCs w:val="false"/>
-        </w:rPr>
-      </w:pPr>
-      <w:r>
-        <w:rPr>
-          <w:b w:val="false"/>
-          <w:bCs w:val="false"/>
-        </w:rPr>
-      </w:r>
-    </w:p>
-    <w:p>
-      <w:pPr>
-        <w:pStyle w:val="Heading2"/>
+          <w:b w:val="false"/>
+          <w:bCs w:val="false"/>
+        </w:rPr>
+      </w:pPr>
+      <w:r>
+        <w:rPr>
+          <w:b w:val="false"/>
+          <w:bCs w:val="false"/>
+        </w:rPr>
+      </w:r>
+    </w:p>
+    <w:p>
+      <w:pPr>
+        <w:pStyle w:val="Titre2"/>
         <w:numPr>
           <w:ilvl w:val="1"/>
           <w:numId w:val="1"/>
@@ -325,11 +289,12 @@
     </w:p>
     <w:p>
       <w:pPr>
-        <w:pStyle w:val="BodyText"/>
-        <w:bidi w:val="0"/>
-        <w:spacing w:before="0" w:after="0"/>
-        <w:jc w:val="left"/>
-        <w:rPr>
+        <w:pStyle w:val="Corpsdetexte"/>
+        <w:bidi w:val="0"/>
+        <w:spacing w:before="0" w:after="0"/>
+        <w:jc w:val="left"/>
+        <w:rPr>
+          <w:b/>
           <w:b/>
           <w:bCs/>
         </w:rPr>
@@ -351,11 +316,12 @@
     </w:p>
     <w:p>
       <w:pPr>
-        <w:pStyle w:val="BodyText"/>
-        <w:bidi w:val="0"/>
-        <w:spacing w:before="0" w:after="0"/>
-        <w:jc w:val="left"/>
-        <w:rPr>
+        <w:pStyle w:val="Corpsdetexte"/>
+        <w:bidi w:val="0"/>
+        <w:spacing w:before="0" w:after="0"/>
+        <w:jc w:val="left"/>
+        <w:rPr>
+          <w:b/>
           <w:b/>
           <w:bCs/>
         </w:rPr>
@@ -377,11 +343,12 @@
     </w:p>
     <w:p>
       <w:pPr>
-        <w:pStyle w:val="BodyText"/>
-        <w:bidi w:val="0"/>
-        <w:spacing w:before="0" w:after="0"/>
-        <w:jc w:val="left"/>
-        <w:rPr>
+        <w:pStyle w:val="Corpsdetexte"/>
+        <w:bidi w:val="0"/>
+        <w:spacing w:before="0" w:after="0"/>
+        <w:jc w:val="left"/>
+        <w:rPr>
+          <w:b/>
           <w:b/>
           <w:bCs/>
         </w:rPr>
@@ -396,7 +363,7 @@
     </w:p>
     <w:p>
       <w:pPr>
-        <w:pStyle w:val="BodyText"/>
+        <w:pStyle w:val="Corpsdetexte"/>
         <w:numPr>
           <w:ilvl w:val="0"/>
           <w:numId w:val="3"/>
@@ -406,6 +373,7 @@
         <w:jc w:val="left"/>
         <w:rPr>
           <w:b w:val="false"/>
+          <w:b w:val="false"/>
           <w:bCs w:val="false"/>
         </w:rPr>
       </w:pPr>
@@ -419,7 +387,7 @@
     </w:p>
     <w:p>
       <w:pPr>
-        <w:pStyle w:val="BodyText"/>
+        <w:pStyle w:val="Corpsdetexte"/>
         <w:numPr>
           <w:ilvl w:val="0"/>
           <w:numId w:val="3"/>
@@ -429,34 +397,21 @@
         <w:jc w:val="left"/>
         <w:rPr>
           <w:b w:val="false"/>
-          <w:bCs w:val="false"/>
-        </w:rPr>
-      </w:pPr>
-      <w:r>
-        <w:rPr>
-          <w:b w:val="false"/>
-          <w:bCs w:val="false"/>
-        </w:rPr>
-        <w:t xml:space="preserve">Accès </w:t>
-      </w:r>
-      <w:r>
-        <w:rPr>
-          <w:b w:val="false"/>
-          <w:bCs w:val="false"/>
-        </w:rPr>
-        <w:t>SSH</w:t>
-      </w:r>
-      <w:r>
-        <w:rPr>
-          <w:b w:val="false"/>
-          <w:bCs w:val="false"/>
-        </w:rPr>
-        <w:t xml:space="preserve"> + exécution commande à distance</w:t>
-      </w:r>
-    </w:p>
-    <w:p>
-      <w:pPr>
-        <w:pStyle w:val="BodyText"/>
+          <w:b w:val="false"/>
+          <w:bCs w:val="false"/>
+        </w:rPr>
+      </w:pPr>
+      <w:r>
+        <w:rPr>
+          <w:b w:val="false"/>
+          <w:bCs w:val="false"/>
+        </w:rPr>
+        <w:t>Accès SSH + exécution commande à distance</w:t>
+      </w:r>
+    </w:p>
+    <w:p>
+      <w:pPr>
+        <w:pStyle w:val="Corpsdetexte"/>
         <w:numPr>
           <w:ilvl w:val="0"/>
           <w:numId w:val="3"/>
@@ -466,6 +421,7 @@
         <w:jc w:val="left"/>
         <w:rPr>
           <w:b w:val="false"/>
+          <w:b w:val="false"/>
           <w:bCs w:val="false"/>
         </w:rPr>
       </w:pPr>
@@ -479,7 +435,7 @@
     </w:p>
     <w:p>
       <w:pPr>
-        <w:pStyle w:val="BodyText"/>
+        <w:pStyle w:val="Corpsdetexte"/>
         <w:numPr>
           <w:ilvl w:val="0"/>
           <w:numId w:val="3"/>
@@ -489,6 +445,7 @@
         <w:jc w:val="left"/>
         <w:rPr>
           <w:b w:val="false"/>
+          <w:b w:val="false"/>
           <w:bCs w:val="false"/>
         </w:rPr>
       </w:pPr>
@@ -502,11 +459,12 @@
     </w:p>
     <w:p>
       <w:pPr>
-        <w:pStyle w:val="BodyText"/>
-        <w:bidi w:val="0"/>
-        <w:spacing w:before="0" w:after="0"/>
-        <w:jc w:val="left"/>
-        <w:rPr>
+        <w:pStyle w:val="Corpsdetexte"/>
+        <w:bidi w:val="0"/>
+        <w:spacing w:before="0" w:after="0"/>
+        <w:jc w:val="left"/>
+        <w:rPr>
+          <w:b/>
           <w:b/>
           <w:bCs/>
         </w:rPr>
@@ -528,11 +486,12 @@
     </w:p>
     <w:p>
       <w:pPr>
-        <w:pStyle w:val="BodyText"/>
-        <w:bidi w:val="0"/>
-        <w:spacing w:before="0" w:after="0"/>
-        <w:jc w:val="left"/>
-        <w:rPr>
+        <w:pStyle w:val="Corpsdetexte"/>
+        <w:bidi w:val="0"/>
+        <w:spacing w:before="0" w:after="0"/>
+        <w:jc w:val="left"/>
+        <w:rPr>
+          <w:b/>
           <w:b/>
           <w:bCs/>
         </w:rPr>
@@ -549,14 +508,1126 @@
           <w:b w:val="false"/>
           <w:bCs w:val="false"/>
         </w:rPr>
-        <w:t xml:space="preserve">Renvoyer l’erreur + accès </w:t>
-      </w:r>
-      <w:r>
-        <w:rPr>
-          <w:b w:val="false"/>
-          <w:bCs w:val="false"/>
-        </w:rPr>
-        <w:t>SSH</w:t>
+        <w:t>Renvoyer l’erreur + accès SSH</w:t>
+      </w:r>
+    </w:p>
+    <w:p>
+      <w:pPr>
+        <w:pStyle w:val="Corpsdetexte"/>
+        <w:bidi w:val="0"/>
+        <w:spacing w:before="0" w:after="0"/>
+        <w:jc w:val="left"/>
+        <w:rPr>
+          <w:b/>
+          <w:b/>
+          <w:bCs/>
+        </w:rPr>
+      </w:pPr>
+      <w:r>
+        <w:rPr/>
+      </w:r>
+    </w:p>
+    <w:p>
+      <w:pPr>
+        <w:pStyle w:val="Corpsdetexte"/>
+        <w:bidi w:val="0"/>
+        <w:spacing w:before="0" w:after="0"/>
+        <w:jc w:val="left"/>
+        <w:rPr>
+          <w:b/>
+          <w:b/>
+          <w:bCs/>
+        </w:rPr>
+      </w:pPr>
+      <w:r>
+        <w:rPr>
+          <w:b/>
+          <w:bCs/>
+        </w:rPr>
+        <w:t>SCHEMA</w:t>
+      </w:r>
+    </w:p>
+    <w:p>
+      <w:pPr>
+        <w:pStyle w:val="Corpsdetexte"/>
+        <w:bidi w:val="0"/>
+        <w:spacing w:before="0" w:after="0"/>
+        <w:jc w:val="left"/>
+        <w:rPr>
+          <w:b w:val="false"/>
+          <w:b w:val="false"/>
+          <w:bCs w:val="false"/>
+        </w:rPr>
+      </w:pPr>
+      <w:r>
+        <w:rPr>
+          <w:b w:val="false"/>
+          <w:bCs w:val="false"/>
+        </w:rPr>
+        <w:t>User</w:t>
+      </w:r>
+    </w:p>
+    <w:p>
+      <w:pPr>
+        <w:pStyle w:val="Corpsdetexte"/>
+        <w:bidi w:val="0"/>
+        <w:spacing w:before="0" w:after="0"/>
+        <w:jc w:val="left"/>
+        <w:rPr>
+          <w:b w:val="false"/>
+          <w:b w:val="false"/>
+          <w:bCs w:val="false"/>
+        </w:rPr>
+      </w:pPr>
+      <w:r>
+        <w:rPr>
+          <w:b w:val="false"/>
+          <w:bCs w:val="false"/>
+        </w:rPr>
+        <w:t>{</w:t>
+      </w:r>
+    </w:p>
+    <w:p>
+      <w:pPr>
+        <w:pStyle w:val="Corpsdetexte"/>
+        <w:bidi w:val="0"/>
+        <w:spacing w:before="0" w:after="0"/>
+        <w:jc w:val="left"/>
+        <w:rPr>
+          <w:b w:val="false"/>
+          <w:b w:val="false"/>
+          <w:bCs w:val="false"/>
+        </w:rPr>
+      </w:pPr>
+      <w:r>
+        <w:rPr>
+          <w:b w:val="false"/>
+          <w:bCs w:val="false"/>
+        </w:rPr>
+        <w:tab/>
+        <w:t>Username</w:t>
+      </w:r>
+    </w:p>
+    <w:p>
+      <w:pPr>
+        <w:pStyle w:val="Corpsdetexte"/>
+        <w:bidi w:val="0"/>
+        <w:spacing w:before="0" w:after="0"/>
+        <w:jc w:val="left"/>
+        <w:rPr>
+          <w:b w:val="false"/>
+          <w:b w:val="false"/>
+          <w:bCs w:val="false"/>
+        </w:rPr>
+      </w:pPr>
+      <w:r>
+        <w:rPr>
+          <w:b w:val="false"/>
+          <w:bCs w:val="false"/>
+        </w:rPr>
+        <w:tab/>
+        <w:t>Password</w:t>
+      </w:r>
+    </w:p>
+    <w:p>
+      <w:pPr>
+        <w:pStyle w:val="Corpsdetexte"/>
+        <w:bidi w:val="0"/>
+        <w:spacing w:before="0" w:after="0"/>
+        <w:jc w:val="left"/>
+        <w:rPr>
+          <w:b w:val="false"/>
+          <w:b w:val="false"/>
+          <w:bCs w:val="false"/>
+        </w:rPr>
+      </w:pPr>
+      <w:r>
+        <w:rPr>
+          <w:b w:val="false"/>
+          <w:bCs w:val="false"/>
+        </w:rPr>
+        <w:tab/>
+        <w:t>Profil</w:t>
+      </w:r>
+    </w:p>
+    <w:p>
+      <w:pPr>
+        <w:pStyle w:val="Corpsdetexte"/>
+        <w:bidi w:val="0"/>
+        <w:spacing w:before="0" w:after="0"/>
+        <w:jc w:val="left"/>
+        <w:rPr>
+          <w:b w:val="false"/>
+          <w:b w:val="false"/>
+          <w:bCs w:val="false"/>
+        </w:rPr>
+      </w:pPr>
+      <w:r>
+        <w:rPr>
+          <w:b w:val="false"/>
+          <w:bCs w:val="false"/>
+        </w:rPr>
+        <w:tab/>
+        <w:t>Role</w:t>
+      </w:r>
+    </w:p>
+    <w:p>
+      <w:pPr>
+        <w:pStyle w:val="Corpsdetexte"/>
+        <w:bidi w:val="0"/>
+        <w:spacing w:before="0" w:after="0"/>
+        <w:jc w:val="left"/>
+        <w:rPr>
+          <w:b w:val="false"/>
+          <w:b w:val="false"/>
+          <w:bCs w:val="false"/>
+        </w:rPr>
+      </w:pPr>
+      <w:r>
+        <w:rPr>
+          <w:b w:val="false"/>
+          <w:bCs w:val="false"/>
+        </w:rPr>
+        <w:t>}</w:t>
+      </w:r>
+    </w:p>
+    <w:p>
+      <w:pPr>
+        <w:pStyle w:val="Corpsdetexte"/>
+        <w:bidi w:val="0"/>
+        <w:spacing w:before="0" w:after="0"/>
+        <w:jc w:val="left"/>
+        <w:rPr>
+          <w:b w:val="false"/>
+          <w:b w:val="false"/>
+          <w:bCs w:val="false"/>
+        </w:rPr>
+      </w:pPr>
+      <w:r>
+        <w:rPr>
+          <w:b w:val="false"/>
+          <w:bCs w:val="false"/>
+        </w:rPr>
+        <w:t>Serveur</w:t>
+      </w:r>
+    </w:p>
+    <w:p>
+      <w:pPr>
+        <w:pStyle w:val="Corpsdetexte"/>
+        <w:bidi w:val="0"/>
+        <w:spacing w:before="0" w:after="0"/>
+        <w:jc w:val="left"/>
+        <w:rPr>
+          <w:b w:val="false"/>
+          <w:b w:val="false"/>
+          <w:bCs w:val="false"/>
+        </w:rPr>
+      </w:pPr>
+      <w:r>
+        <w:rPr>
+          <w:b w:val="false"/>
+          <w:bCs w:val="false"/>
+        </w:rPr>
+        <w:t>{</w:t>
+      </w:r>
+    </w:p>
+    <w:p>
+      <w:pPr>
+        <w:pStyle w:val="Corpsdetexte"/>
+        <w:bidi w:val="0"/>
+        <w:spacing w:before="0" w:after="0"/>
+        <w:jc w:val="left"/>
+        <w:rPr>
+          <w:b w:val="false"/>
+          <w:b w:val="false"/>
+          <w:bCs w:val="false"/>
+        </w:rPr>
+      </w:pPr>
+      <w:r>
+        <w:rPr>
+          <w:b w:val="false"/>
+          <w:bCs w:val="false"/>
+        </w:rPr>
+        <w:tab/>
+        <w:t>Nom</w:t>
+      </w:r>
+    </w:p>
+    <w:p>
+      <w:pPr>
+        <w:pStyle w:val="Corpsdetexte"/>
+        <w:bidi w:val="0"/>
+        <w:spacing w:before="0" w:after="0"/>
+        <w:jc w:val="left"/>
+        <w:rPr>
+          <w:b w:val="false"/>
+          <w:b w:val="false"/>
+          <w:bCs w:val="false"/>
+        </w:rPr>
+      </w:pPr>
+      <w:r>
+        <w:rPr>
+          <w:b w:val="false"/>
+          <w:bCs w:val="false"/>
+        </w:rPr>
+        <w:tab/>
+        <w:t>IP_serveur</w:t>
+      </w:r>
+    </w:p>
+    <w:p>
+      <w:pPr>
+        <w:pStyle w:val="Corpsdetexte"/>
+        <w:bidi w:val="0"/>
+        <w:spacing w:before="0" w:after="0"/>
+        <w:jc w:val="left"/>
+        <w:rPr>
+          <w:b w:val="false"/>
+          <w:b w:val="false"/>
+          <w:bCs w:val="false"/>
+        </w:rPr>
+      </w:pPr>
+      <w:r>
+        <w:rPr>
+          <w:b w:val="false"/>
+          <w:bCs w:val="false"/>
+        </w:rPr>
+        <w:tab/>
+        <w:t>Url_serveur</w:t>
+      </w:r>
+    </w:p>
+    <w:p>
+      <w:pPr>
+        <w:pStyle w:val="Corpsdetexte"/>
+        <w:bidi w:val="0"/>
+        <w:spacing w:before="0" w:after="0"/>
+        <w:jc w:val="left"/>
+        <w:rPr>
+          <w:b w:val="false"/>
+          <w:b w:val="false"/>
+          <w:bCs w:val="false"/>
+        </w:rPr>
+      </w:pPr>
+      <w:r>
+        <w:rPr>
+          <w:b w:val="false"/>
+          <w:bCs w:val="false"/>
+        </w:rPr>
+        <w:t>}</w:t>
+      </w:r>
+    </w:p>
+    <w:p>
+      <w:pPr>
+        <w:pStyle w:val="Corpsdetexte"/>
+        <w:bidi w:val="0"/>
+        <w:spacing w:before="0" w:after="0"/>
+        <w:jc w:val="left"/>
+        <w:rPr>
+          <w:b/>
+          <w:b/>
+          <w:bCs/>
+        </w:rPr>
+      </w:pPr>
+      <w:r>
+        <w:rPr/>
+      </w:r>
+    </w:p>
+    <w:p>
+      <w:pPr>
+        <w:pStyle w:val="Corpsdetexte"/>
+        <w:bidi w:val="0"/>
+        <w:spacing w:before="0" w:after="0"/>
+        <w:jc w:val="left"/>
+        <w:rPr>
+          <w:b/>
+          <w:b/>
+          <w:bCs/>
+        </w:rPr>
+      </w:pPr>
+      <w:r>
+        <w:rPr/>
+      </w:r>
+    </w:p>
+    <w:p>
+      <w:pPr>
+        <w:pStyle w:val="Corpsdetexte"/>
+        <w:bidi w:val="0"/>
+        <w:spacing w:before="0" w:after="0"/>
+        <w:jc w:val="left"/>
+        <w:rPr>
+          <w:b/>
+          <w:b/>
+          <w:bCs/>
+        </w:rPr>
+      </w:pPr>
+      <w:r>
+        <w:rPr/>
+      </w:r>
+    </w:p>
+    <w:p>
+      <w:pPr>
+        <w:pStyle w:val="Corpsdetexte"/>
+        <w:bidi w:val="0"/>
+        <w:spacing w:before="0" w:after="0"/>
+        <w:jc w:val="left"/>
+        <w:rPr>
+          <w:b/>
+          <w:b/>
+          <w:bCs/>
+        </w:rPr>
+      </w:pPr>
+      <w:r>
+        <w:rPr/>
+      </w:r>
+    </w:p>
+    <w:p>
+      <w:pPr>
+        <w:pStyle w:val="Corpsdetexte"/>
+        <w:bidi w:val="0"/>
+        <w:spacing w:before="0" w:after="0"/>
+        <w:jc w:val="left"/>
+        <w:rPr>
+          <w:b/>
+          <w:b/>
+          <w:bCs/>
+        </w:rPr>
+      </w:pPr>
+      <w:r>
+        <w:rPr/>
+      </w:r>
+    </w:p>
+    <w:p>
+      <w:pPr>
+        <w:pStyle w:val="Corpsdetexte"/>
+        <w:bidi w:val="0"/>
+        <w:spacing w:before="0" w:after="0"/>
+        <w:jc w:val="left"/>
+        <w:rPr>
+          <w:b/>
+          <w:b/>
+          <w:bCs/>
+        </w:rPr>
+      </w:pPr>
+      <w:r>
+        <w:rPr>
+          <w:b/>
+          <w:bCs/>
+        </w:rPr>
+        <w:t>CONCEPTION // FRONT ATTENDU</w:t>
+      </w:r>
+    </w:p>
+    <w:p>
+      <w:pPr>
+        <w:pStyle w:val="Corpsdetexte"/>
+        <w:bidi w:val="0"/>
+        <w:spacing w:before="0" w:after="0"/>
+        <w:jc w:val="left"/>
+        <w:rPr>
+          <w:b/>
+          <w:b/>
+          <w:bCs/>
+        </w:rPr>
+      </w:pPr>
+      <w:r>
+        <w:rPr/>
+      </w:r>
+    </w:p>
+    <w:p>
+      <w:pPr>
+        <w:pStyle w:val="Corpsdetexte"/>
+        <w:bidi w:val="0"/>
+        <w:spacing w:before="0" w:after="0"/>
+        <w:jc w:val="left"/>
+        <w:rPr>
+          <w:b/>
+          <w:b/>
+          <w:bCs/>
+        </w:rPr>
+      </w:pPr>
+      <w:r>
+        <w:rPr>
+          <w:b w:val="false"/>
+          <w:bCs w:val="false"/>
+        </w:rPr>
+        <w:t>CREATION COMPTE USER</w:t>
+      </w:r>
+    </w:p>
+    <w:p>
+      <w:pPr>
+        <w:pStyle w:val="Corpsdetexte"/>
+        <w:bidi w:val="0"/>
+        <w:spacing w:before="0" w:after="0"/>
+        <w:jc w:val="left"/>
+        <w:rPr>
+          <w:b/>
+          <w:b/>
+          <w:bCs/>
+        </w:rPr>
+      </w:pPr>
+      <w:r>
+        <w:rPr>
+          <w:b w:val="false"/>
+          <w:bCs w:val="false"/>
+        </w:rPr>
+        <w:t>Username</w:t>
+      </w:r>
+    </w:p>
+    <w:p>
+      <w:pPr>
+        <w:pStyle w:val="Corpsdetexte"/>
+        <w:bidi w:val="0"/>
+        <w:spacing w:before="0" w:after="0"/>
+        <w:jc w:val="left"/>
+        <w:rPr>
+          <w:b/>
+          <w:b/>
+          <w:bCs/>
+        </w:rPr>
+      </w:pPr>
+      <w:r>
+        <w:rPr>
+          <w:b w:val="false"/>
+          <w:bCs w:val="false"/>
+        </w:rPr>
+        <w:t>password (hasher)</w:t>
+      </w:r>
+    </w:p>
+    <w:p>
+      <w:pPr>
+        <w:pStyle w:val="Corpsdetexte"/>
+        <w:bidi w:val="0"/>
+        <w:spacing w:before="0" w:after="0"/>
+        <w:jc w:val="left"/>
+        <w:rPr>
+          <w:b/>
+          <w:b/>
+          <w:bCs/>
+        </w:rPr>
+      </w:pPr>
+      <w:r>
+        <w:rPr>
+          <w:b w:val="false"/>
+          <w:bCs w:val="false"/>
+        </w:rPr>
+        <w:t>Profil(null par defaut)</w:t>
+      </w:r>
+    </w:p>
+    <w:p>
+      <w:pPr>
+        <w:pStyle w:val="Corpsdetexte"/>
+        <w:bidi w:val="0"/>
+        <w:spacing w:before="0" w:after="0"/>
+        <w:jc w:val="left"/>
+        <w:rPr>
+          <w:b/>
+          <w:b/>
+          <w:bCs/>
+        </w:rPr>
+      </w:pPr>
+      <w:r>
+        <w:rPr>
+          <w:b w:val="false"/>
+          <w:bCs w:val="false"/>
+        </w:rPr>
+        <w:t>Role(user par défaut)</w:t>
+      </w:r>
+    </w:p>
+    <w:p>
+      <w:pPr>
+        <w:pStyle w:val="Corpsdetexte"/>
+        <w:bidi w:val="0"/>
+        <w:spacing w:before="0" w:after="0"/>
+        <w:jc w:val="left"/>
+        <w:rPr>
+          <w:b/>
+          <w:b/>
+          <w:bCs/>
+        </w:rPr>
+      </w:pPr>
+      <w:r>
+        <w:rPr/>
+      </w:r>
+    </w:p>
+    <w:p>
+      <w:pPr>
+        <w:pStyle w:val="Corpsdetexte"/>
+        <w:bidi w:val="0"/>
+        <w:spacing w:before="0" w:after="0"/>
+        <w:jc w:val="left"/>
+        <w:rPr>
+          <w:b/>
+          <w:b/>
+          <w:bCs/>
+        </w:rPr>
+      </w:pPr>
+      <w:r>
+        <w:rPr>
+          <w:b w:val="false"/>
+          <w:bCs w:val="false"/>
+        </w:rPr>
+        <w:t>LOGIN COMPTE USER</w:t>
+      </w:r>
+    </w:p>
+    <w:p>
+      <w:pPr>
+        <w:pStyle w:val="Corpsdetexte"/>
+        <w:bidi w:val="0"/>
+        <w:spacing w:before="0" w:after="0"/>
+        <w:jc w:val="left"/>
+        <w:rPr>
+          <w:b/>
+          <w:b/>
+          <w:bCs/>
+        </w:rPr>
+      </w:pPr>
+      <w:r>
+        <w:rPr>
+          <w:b w:val="false"/>
+          <w:bCs w:val="false"/>
+        </w:rPr>
+        <w:t>Username</w:t>
+      </w:r>
+    </w:p>
+    <w:p>
+      <w:pPr>
+        <w:pStyle w:val="Corpsdetexte"/>
+        <w:bidi w:val="0"/>
+        <w:spacing w:before="0" w:after="0"/>
+        <w:jc w:val="left"/>
+        <w:rPr>
+          <w:b/>
+          <w:b/>
+          <w:bCs/>
+        </w:rPr>
+      </w:pPr>
+      <w:r>
+        <w:rPr>
+          <w:b w:val="false"/>
+          <w:bCs w:val="false"/>
+        </w:rPr>
+        <w:t>Password</w:t>
+      </w:r>
+    </w:p>
+    <w:p>
+      <w:pPr>
+        <w:pStyle w:val="Corpsdetexte"/>
+        <w:bidi w:val="0"/>
+        <w:spacing w:before="0" w:after="0"/>
+        <w:jc w:val="left"/>
+        <w:rPr>
+          <w:b/>
+          <w:b/>
+          <w:bCs/>
+        </w:rPr>
+      </w:pPr>
+      <w:r>
+        <w:rPr>
+          <w:b w:val="false"/>
+          <w:bCs w:val="false"/>
+        </w:rPr>
+        <w:t>+ (mdp oublié) // tianjara OTP via email</w:t>
+      </w:r>
+    </w:p>
+    <w:p>
+      <w:pPr>
+        <w:pStyle w:val="Corpsdetexte"/>
+        <w:bidi w:val="0"/>
+        <w:spacing w:before="0" w:after="0"/>
+        <w:jc w:val="left"/>
+        <w:rPr>
+          <w:b/>
+          <w:b/>
+          <w:bCs/>
+        </w:rPr>
+      </w:pPr>
+      <w:r>
+        <w:rPr/>
+      </w:r>
+    </w:p>
+    <w:p>
+      <w:pPr>
+        <w:pStyle w:val="Corpsdetexte"/>
+        <w:bidi w:val="0"/>
+        <w:spacing w:before="0" w:after="0"/>
+        <w:jc w:val="left"/>
+        <w:rPr>
+          <w:b/>
+          <w:b/>
+          <w:bCs/>
+        </w:rPr>
+      </w:pPr>
+      <w:r>
+        <w:rPr>
+          <w:b w:val="false"/>
+          <w:bCs w:val="false"/>
+        </w:rPr>
+        <w:t>CREATION SERVEUR PAR USER</w:t>
+      </w:r>
+    </w:p>
+    <w:p>
+      <w:pPr>
+        <w:pStyle w:val="Corpsdetexte"/>
+        <w:bidi w:val="0"/>
+        <w:spacing w:before="0" w:after="0"/>
+        <w:jc w:val="left"/>
+        <w:rPr>
+          <w:b/>
+          <w:b/>
+          <w:bCs/>
+        </w:rPr>
+      </w:pPr>
+      <w:r>
+        <w:rPr>
+          <w:b w:val="false"/>
+          <w:bCs w:val="false"/>
+        </w:rPr>
+        <w:t>Nom_serveur</w:t>
+      </w:r>
+    </w:p>
+    <w:p>
+      <w:pPr>
+        <w:pStyle w:val="Corpsdetexte"/>
+        <w:bidi w:val="0"/>
+        <w:spacing w:before="0" w:after="0"/>
+        <w:jc w:val="left"/>
+        <w:rPr>
+          <w:b/>
+          <w:b/>
+          <w:bCs/>
+        </w:rPr>
+      </w:pPr>
+      <w:r>
+        <w:rPr>
+          <w:b w:val="false"/>
+          <w:bCs w:val="false"/>
+        </w:rPr>
+        <w:t>IP_serveur</w:t>
+      </w:r>
+    </w:p>
+    <w:p>
+      <w:pPr>
+        <w:pStyle w:val="Corpsdetexte"/>
+        <w:bidi w:val="0"/>
+        <w:spacing w:before="0" w:after="0"/>
+        <w:jc w:val="left"/>
+        <w:rPr>
+          <w:b/>
+          <w:b/>
+          <w:bCs/>
+        </w:rPr>
+      </w:pPr>
+      <w:r>
+        <w:rPr>
+          <w:b w:val="false"/>
+          <w:bCs w:val="false"/>
+        </w:rPr>
+        <w:t>Url_serveur</w:t>
+      </w:r>
+    </w:p>
+    <w:p>
+      <w:pPr>
+        <w:pStyle w:val="Corpsdetexte"/>
+        <w:bidi w:val="0"/>
+        <w:spacing w:before="0" w:after="0"/>
+        <w:jc w:val="left"/>
+        <w:rPr>
+          <w:b/>
+          <w:b/>
+          <w:bCs/>
+        </w:rPr>
+      </w:pPr>
+      <w:r>
+        <w:rPr/>
+      </w:r>
+    </w:p>
+    <w:p>
+      <w:pPr>
+        <w:pStyle w:val="Corpsdetexte"/>
+        <w:bidi w:val="0"/>
+        <w:spacing w:before="0" w:after="0"/>
+        <w:jc w:val="left"/>
+        <w:rPr>
+          <w:b/>
+          <w:b/>
+          <w:bCs/>
+        </w:rPr>
+      </w:pPr>
+      <w:r>
+        <w:rPr>
+          <w:b w:val="false"/>
+          <w:bCs w:val="false"/>
+        </w:rPr>
+        <w:t>LISTAGE SERVEUR PAR USER PROPRIETAIRE</w:t>
+      </w:r>
+    </w:p>
+    <w:p>
+      <w:pPr>
+        <w:pStyle w:val="Corpsdetexte"/>
+        <w:bidi w:val="0"/>
+        <w:spacing w:before="0" w:after="0"/>
+        <w:jc w:val="left"/>
+        <w:rPr>
+          <w:b/>
+          <w:b/>
+          <w:bCs/>
+        </w:rPr>
+      </w:pPr>
+      <w:r>
+        <w:rPr>
+          <w:b w:val="false"/>
+          <w:bCs w:val="false"/>
+        </w:rPr>
+        <w:t>Nom_serveur</w:t>
+      </w:r>
+    </w:p>
+    <w:p>
+      <w:pPr>
+        <w:pStyle w:val="Corpsdetexte"/>
+        <w:bidi w:val="0"/>
+        <w:spacing w:before="0" w:after="0"/>
+        <w:jc w:val="left"/>
+        <w:rPr>
+          <w:b/>
+          <w:b/>
+          <w:bCs/>
+        </w:rPr>
+      </w:pPr>
+      <w:r>
+        <w:rPr>
+          <w:b w:val="false"/>
+          <w:bCs w:val="false"/>
+        </w:rPr>
+        <w:t>Status (Active / Inactive )</w:t>
+      </w:r>
+    </w:p>
+    <w:p>
+      <w:pPr>
+        <w:pStyle w:val="Corpsdetexte"/>
+        <w:bidi w:val="0"/>
+        <w:spacing w:before="0" w:after="0"/>
+        <w:jc w:val="left"/>
+        <w:rPr>
+          <w:b/>
+          <w:b/>
+          <w:bCs/>
+        </w:rPr>
+      </w:pPr>
+      <w:r>
+        <w:rPr>
+          <w:b w:val="false"/>
+          <w:bCs w:val="false"/>
+        </w:rPr>
+        <w:t>IP_serveur</w:t>
+      </w:r>
+    </w:p>
+    <w:p>
+      <w:pPr>
+        <w:pStyle w:val="Corpsdetexte"/>
+        <w:bidi w:val="0"/>
+        <w:spacing w:before="0" w:after="0"/>
+        <w:jc w:val="left"/>
+        <w:rPr>
+          <w:b/>
+          <w:b/>
+          <w:bCs/>
+        </w:rPr>
+      </w:pPr>
+      <w:r>
+        <w:rPr>
+          <w:b w:val="false"/>
+          <w:bCs w:val="false"/>
+        </w:rPr>
+        <w:t>Url_serveur</w:t>
+      </w:r>
+    </w:p>
+    <w:p>
+      <w:pPr>
+        <w:pStyle w:val="Corpsdetexte"/>
+        <w:bidi w:val="0"/>
+        <w:spacing w:before="0" w:after="0"/>
+        <w:jc w:val="left"/>
+        <w:rPr>
+          <w:b/>
+          <w:b/>
+          <w:bCs/>
+        </w:rPr>
+      </w:pPr>
+      <w:r>
+        <w:rPr/>
+      </w:r>
+    </w:p>
+    <w:p>
+      <w:pPr>
+        <w:pStyle w:val="Corpsdetexte"/>
+        <w:bidi w:val="0"/>
+        <w:spacing w:before="0" w:after="0"/>
+        <w:jc w:val="left"/>
+        <w:rPr>
+          <w:b/>
+          <w:b/>
+          <w:bCs/>
+        </w:rPr>
+      </w:pPr>
+      <w:r>
+        <w:rPr>
+          <w:b w:val="false"/>
+          <w:bCs w:val="false"/>
+        </w:rPr>
+        <w:t>HISTORIQUE D’ACTIVITÉ DU SERVEUR</w:t>
+      </w:r>
+    </w:p>
+    <w:p>
+      <w:pPr>
+        <w:pStyle w:val="Corpsdetexte"/>
+        <w:bidi w:val="0"/>
+        <w:spacing w:before="0" w:after="0"/>
+        <w:jc w:val="left"/>
+        <w:rPr>
+          <w:b/>
+          <w:b/>
+          <w:bCs/>
+        </w:rPr>
+      </w:pPr>
+      <w:r>
+        <w:rPr>
+          <w:b w:val="false"/>
+          <w:bCs w:val="false"/>
+        </w:rPr>
+        <w:t>Nom_serveur</w:t>
+      </w:r>
+    </w:p>
+    <w:p>
+      <w:pPr>
+        <w:pStyle w:val="Corpsdetexte"/>
+        <w:bidi w:val="0"/>
+        <w:spacing w:before="0" w:after="0"/>
+        <w:jc w:val="left"/>
+        <w:rPr>
+          <w:b/>
+          <w:b/>
+          <w:bCs/>
+        </w:rPr>
+      </w:pPr>
+      <w:r>
+        <w:rPr>
+          <w:b w:val="false"/>
+          <w:bCs w:val="false"/>
+        </w:rPr>
+        <w:t>Status(Active / Inactive)</w:t>
+      </w:r>
+    </w:p>
+    <w:p>
+      <w:pPr>
+        <w:pStyle w:val="Corpsdetexte"/>
+        <w:bidi w:val="0"/>
+        <w:spacing w:before="0" w:after="0"/>
+        <w:jc w:val="left"/>
+        <w:rPr>
+          <w:b/>
+          <w:b/>
+          <w:bCs/>
+        </w:rPr>
+      </w:pPr>
+      <w:r>
+        <w:rPr>
+          <w:b w:val="false"/>
+          <w:bCs w:val="false"/>
+        </w:rPr>
+        <w:t>Cas ( Probleme ou solution appliquer )</w:t>
+      </w:r>
+    </w:p>
+    <w:p>
+      <w:pPr>
+        <w:pStyle w:val="Corpsdetexte"/>
+        <w:bidi w:val="0"/>
+        <w:spacing w:before="0" w:after="0"/>
+        <w:jc w:val="left"/>
+        <w:rPr>
+          <w:b/>
+          <w:b/>
+          <w:bCs/>
+        </w:rPr>
+      </w:pPr>
+      <w:r>
+        <w:rPr/>
+      </w:r>
+    </w:p>
+    <w:p>
+      <w:pPr>
+        <w:pStyle w:val="Corpsdetexte"/>
+        <w:bidi w:val="0"/>
+        <w:spacing w:before="0" w:after="0"/>
+        <w:jc w:val="left"/>
+        <w:rPr>
+          <w:b/>
+          <w:b/>
+          <w:bCs/>
+        </w:rPr>
+      </w:pPr>
+      <w:r>
+        <w:rPr>
+          <w:b w:val="false"/>
+          <w:bCs w:val="false"/>
+        </w:rPr>
+        <w:t>SUPPRESSION SERVEUR</w:t>
+      </w:r>
+    </w:p>
+    <w:p>
+      <w:pPr>
+        <w:pStyle w:val="Corpsdetexte"/>
+        <w:bidi w:val="0"/>
+        <w:spacing w:before="0" w:after="0"/>
+        <w:jc w:val="left"/>
+        <w:rPr>
+          <w:b/>
+          <w:b/>
+          <w:bCs/>
+        </w:rPr>
+      </w:pPr>
+      <w:r>
+        <w:rPr>
+          <w:b w:val="false"/>
+          <w:bCs w:val="false"/>
+        </w:rPr>
+        <w:t>A c</w:t>
+      </w:r>
+      <w:r>
+        <w:rPr>
+          <w:rFonts w:eastAsia="Noto Serif CJK SC" w:cs="Lohit Devanagari"/>
+          <w:b w:val="false"/>
+          <w:bCs w:val="false"/>
+          <w:color w:val="auto"/>
+          <w:kern w:val="2"/>
+          <w:sz w:val="24"/>
+          <w:szCs w:val="24"/>
+          <w:lang w:val="fr-FR" w:eastAsia="zh-CN" w:bidi="hi-IN"/>
+        </w:rPr>
+        <w:t>ôté de la liste</w:t>
+      </w:r>
+    </w:p>
+    <w:p>
+      <w:pPr>
+        <w:pStyle w:val="Corpsdetexte"/>
+        <w:bidi w:val="0"/>
+        <w:spacing w:before="0" w:after="0"/>
+        <w:jc w:val="left"/>
+        <w:rPr>
+          <w:b/>
+          <w:b/>
+          <w:bCs/>
+        </w:rPr>
+      </w:pPr>
+      <w:r>
+        <w:rPr/>
+      </w:r>
+    </w:p>
+    <w:p>
+      <w:pPr>
+        <w:pStyle w:val="Corpsdetexte"/>
+        <w:bidi w:val="0"/>
+        <w:spacing w:before="0" w:after="0"/>
+        <w:jc w:val="left"/>
+        <w:rPr>
+          <w:b/>
+          <w:b/>
+          <w:bCs/>
+          <w:position w:val="0"/>
+          <w:sz w:val="24"/>
+          <w:vertAlign w:val="baseline"/>
+        </w:rPr>
+      </w:pPr>
+      <w:r>
+        <w:rPr>
+          <w:b/>
+          <w:bCs/>
+          <w:position w:val="0"/>
+          <w:sz w:val="24"/>
+          <w:vertAlign w:val="baseline"/>
+        </w:rPr>
+        <w:t>BACK ATTENDU</w:t>
+      </w:r>
+    </w:p>
+    <w:p>
+      <w:pPr>
+        <w:pStyle w:val="Corpsdetexte"/>
+        <w:bidi w:val="0"/>
+        <w:spacing w:before="0" w:after="0"/>
+        <w:jc w:val="left"/>
+        <w:rPr>
+          <w:b/>
+          <w:b/>
+          <w:bCs/>
+          <w:position w:val="0"/>
+          <w:sz w:val="24"/>
+          <w:vertAlign w:val="baseline"/>
+        </w:rPr>
+      </w:pPr>
+      <w:r>
+        <w:rPr>
+          <w:b/>
+          <w:bCs/>
+          <w:position w:val="0"/>
+          <w:sz w:val="24"/>
+          <w:vertAlign w:val="baseline"/>
+        </w:rPr>
+      </w:r>
+    </w:p>
+    <w:p>
+      <w:pPr>
+        <w:pStyle w:val="Corpsdetexte"/>
+        <w:bidi w:val="0"/>
+        <w:spacing w:before="0" w:after="0"/>
+        <w:jc w:val="left"/>
+        <w:rPr>
+          <w:b/>
+          <w:b/>
+          <w:bCs/>
+        </w:rPr>
+      </w:pPr>
+      <w:r>
+        <w:rPr>
+          <w:b w:val="false"/>
+          <w:bCs w:val="false"/>
+        </w:rPr>
+        <w:t>VERIFICATION SERVEUR AUTOMATIQUE (TOUT LES 10 secondes )</w:t>
+      </w:r>
+    </w:p>
+    <w:p>
+      <w:pPr>
+        <w:pStyle w:val="Corpsdetexte"/>
+        <w:bidi w:val="0"/>
+        <w:spacing w:before="0" w:after="0"/>
+        <w:jc w:val="left"/>
+        <w:rPr>
+          <w:b/>
+          <w:b/>
+          <w:bCs/>
+        </w:rPr>
+      </w:pPr>
+      <w:r>
+        <w:rPr>
+          <w:b w:val="false"/>
+          <w:bCs w:val="false"/>
+        </w:rPr>
+        <w:t>Ping ver IP_serveur chaque 10s</w:t>
+      </w:r>
+    </w:p>
+    <w:p>
+      <w:pPr>
+        <w:pStyle w:val="Corpsdetexte"/>
+        <w:bidi w:val="0"/>
+        <w:spacing w:before="0" w:after="0"/>
+        <w:jc w:val="left"/>
+        <w:rPr>
+          <w:b/>
+          <w:b/>
+          <w:bCs/>
+        </w:rPr>
+      </w:pPr>
+      <w:r>
+        <w:rPr>
+          <w:b w:val="false"/>
+          <w:bCs w:val="false"/>
+        </w:rPr>
+        <w:t>Get_api( Url_serveur)</w:t>
       </w:r>
     </w:p>
     <w:sectPr>
@@ -1111,10 +2182,10 @@
       <w:lang w:val="fr-FR" w:eastAsia="zh-CN" w:bidi="hi-IN"/>
     </w:rPr>
   </w:style>
-  <w:style w:type="paragraph" w:styleId="Heading2">
+  <w:style w:type="paragraph" w:styleId="Titre2">
     <w:name w:val="Heading 2"/>
     <w:basedOn w:val="Titre"/>
-    <w:next w:val="BodyText"/>
+    <w:next w:val="Corpsdetexte"/>
     <w:qFormat/>
     <w:pPr>
       <w:numPr>
@@ -1146,7 +2217,7 @@
   <w:style w:type="paragraph" w:styleId="Titre">
     <w:name w:val="Titre"/>
     <w:basedOn w:val="Normal"/>
-    <w:next w:val="BodyText"/>
+    <w:next w:val="Corpsdetexte"/>
     <w:qFormat/>
     <w:pPr>
       <w:keepNext w:val="true"/>
@@ -1158,7 +2229,7 @@
       <w:szCs w:val="28"/>
     </w:rPr>
   </w:style>
-  <w:style w:type="paragraph" w:styleId="BodyText">
+  <w:style w:type="paragraph" w:styleId="Corpsdetexte">
     <w:name w:val="Body Text"/>
     <w:basedOn w:val="Normal"/>
     <w:pPr>
@@ -1166,15 +2237,15 @@
     </w:pPr>
     <w:rPr/>
   </w:style>
-  <w:style w:type="paragraph" w:styleId="List">
+  <w:style w:type="paragraph" w:styleId="Liste">
     <w:name w:val="List"/>
-    <w:basedOn w:val="BodyText"/>
+    <w:basedOn w:val="Corpsdetexte"/>
     <w:pPr/>
     <w:rPr>
       <w:rFonts w:cs="Lohit Devanagari"/>
     </w:rPr>
   </w:style>
-  <w:style w:type="paragraph" w:styleId="Caption">
+  <w:style w:type="paragraph" w:styleId="Lgende">
     <w:name w:val="Caption"/>
     <w:basedOn w:val="Normal"/>
     <w:qFormat/>

</xml_diff>

<commit_message>
test connectivité app et backend
</commit_message>
<xml_diff>
--- a/Conception.docx
+++ b/Conception.docx
@@ -2168,6 +2168,19 @@
           <w:lang w:val="fr-FR" w:eastAsia="zh-CN" w:bidi="hi-IN"/>
         </w:rPr>
       </w:pPr>
+      <w:r>
+        <w:rPr>
+          <w:rFonts w:eastAsia="Noto Serif CJK SC" w:cs="Lohit Devanagari"/>
+          <w:b w:val="false"/>
+          <w:bCs w:val="false"/>
+          <w:color w:val="auto"/>
+          <w:kern w:val="2"/>
+          <w:sz w:val="24"/>
+          <w:szCs w:val="24"/>
+          <w:lang w:val="fr-FR" w:eastAsia="zh-CN" w:bidi="hi-IN"/>
+        </w:rPr>
+        <w:t xml:space="preserve">                                                                                                      </w:t>
+      </w:r>
       <w:r>
         <w:rPr>
           <w:rFonts w:eastAsia="Noto Serif CJK SC" w:cs="Lohit Devanagari"/>

</xml_diff>